<commit_message>
Enhance employment contract template and application functionality: Update employee details formatting in the contract document, add new fields for data extraction in the PDF processing, and improve UI responsiveness with a scrollable sidebar and manual instructions button.
</commit_message>
<xml_diff>
--- a/Modelos/1. CONTRATO DE TRABALHO.docx
+++ b/Modelos/1. CONTRATO DE TRABALHO.docx
@@ -1,6 +1,6 @@
 
 <file path=word/document.xml><?xml version="1.0" encoding="utf-8"?>
-<w:document xmlns:wpc="http://schemas.microsoft.com/office/word/2010/wordprocessingCanvas" xmlns:cx="http://schemas.microsoft.com/office/drawing/2014/chartex" xmlns:cx1="http://schemas.microsoft.com/office/drawing/2015/9/8/chartex" xmlns:cx2="http://schemas.microsoft.com/office/drawing/2015/10/21/chartex" xmlns:cx3="http://schemas.microsoft.com/office/drawing/2016/5/9/chartex" xmlns:cx4="http://schemas.microsoft.com/office/drawing/2016/5/10/chartex" xmlns:cx5="http://schemas.microsoft.com/office/drawing/2016/5/11/chartex" xmlns:cx6="http://schemas.microsoft.com/office/drawing/2016/5/12/chartex" xmlns:cx7="http://schemas.microsoft.com/office/drawing/2016/5/13/chartex" xmlns:cx8="http://schemas.microsoft.com/office/drawing/2016/5/14/chartex" xmlns:mc="http://schemas.openxmlformats.org/markup-compatibility/2006" xmlns:aink="http://schemas.microsoft.com/office/drawing/2016/ink" xmlns:am3d="http://schemas.microsoft.com/office/drawing/2017/model3d" xmlns:o="urn:schemas-microsoft-com:office:office" xmlns:oel="http://schemas.microsoft.com/office/2019/extlst" xmlns:r="http://schemas.openxmlformats.org/officeDocument/2006/relationships" xmlns:m="http://schemas.openxmlformats.org/officeDocument/2006/math" xmlns:v="urn:schemas-microsoft-com:vml" xmlns:wp14="http://schemas.microsoft.com/office/word/2010/wordprocessingDrawing" xmlns:wp="http://schemas.openxmlformats.org/drawingml/2006/wordprocessingDrawing" xmlns:w10="urn:schemas-microsoft-com:office:word" xmlns:w="http://schemas.openxmlformats.org/wordprocessingml/2006/main" xmlns:w14="http://schemas.microsoft.com/office/word/2010/wordml" xmlns:w15="http://schemas.microsoft.com/office/word/2012/wordml" xmlns:w16cex="http://schemas.microsoft.com/office/word/2018/wordml/cex" xmlns:w16cid="http://schemas.microsoft.com/office/word/2016/wordml/cid" xmlns:w16="http://schemas.microsoft.com/office/word/2018/wordml" xmlns:w16du="http://schemas.microsoft.com/office/word/2023/wordml/word16du" xmlns:w16sdtdh="http://schemas.microsoft.com/office/word/2020/wordml/sdtdatahash" xmlns:w16se="http://schemas.microsoft.com/office/word/2015/wordml/symex" xmlns:wpg="http://schemas.microsoft.com/office/word/2010/wordprocessingGroup" xmlns:wpi="http://schemas.microsoft.com/office/word/2010/wordprocessingInk" xmlns:wne="http://schemas.microsoft.com/office/word/2006/wordml" xmlns:wps="http://schemas.microsoft.com/office/word/2010/wordprocessingShape" mc:Ignorable="w14 w15 w16se w16cid w16 w16cex w16sdtdh wp14">
+<w:document xmlns:wpc="http://schemas.microsoft.com/office/word/2010/wordprocessingCanvas" xmlns:cx="http://schemas.microsoft.com/office/drawing/2014/chartex" xmlns:cx1="http://schemas.microsoft.com/office/drawing/2015/9/8/chartex" xmlns:cx2="http://schemas.microsoft.com/office/drawing/2015/10/21/chartex" xmlns:cx3="http://schemas.microsoft.com/office/drawing/2016/5/9/chartex" xmlns:cx4="http://schemas.microsoft.com/office/drawing/2016/5/10/chartex" xmlns:cx5="http://schemas.microsoft.com/office/drawing/2016/5/11/chartex" xmlns:cx6="http://schemas.microsoft.com/office/drawing/2016/5/12/chartex" xmlns:cx7="http://schemas.microsoft.com/office/drawing/2016/5/13/chartex" xmlns:cx8="http://schemas.microsoft.com/office/drawing/2016/5/14/chartex" xmlns:mc="http://schemas.openxmlformats.org/markup-compatibility/2006" xmlns:aink="http://schemas.microsoft.com/office/drawing/2016/ink" xmlns:am3d="http://schemas.microsoft.com/office/drawing/2017/model3d" xmlns:o="urn:schemas-microsoft-com:office:office" xmlns:oel="http://schemas.microsoft.com/office/2019/extlst" xmlns:r="http://schemas.openxmlformats.org/officeDocument/2006/relationships" xmlns:m="http://schemas.openxmlformats.org/officeDocument/2006/math" xmlns:v="urn:schemas-microsoft-com:vml" xmlns:wp14="http://schemas.microsoft.com/office/word/2010/wordprocessingDrawing" xmlns:wp="http://schemas.openxmlformats.org/drawingml/2006/wordprocessingDrawing" xmlns:w10="urn:schemas-microsoft-com:office:word" xmlns:w="http://schemas.openxmlformats.org/wordprocessingml/2006/main" xmlns:w14="http://schemas.microsoft.com/office/word/2010/wordml" xmlns:w15="http://schemas.microsoft.com/office/word/2012/wordml" xmlns:w16cex="http://schemas.microsoft.com/office/word/2018/wordml/cex" xmlns:w16cid="http://schemas.microsoft.com/office/word/2016/wordml/cid" xmlns:w16="http://schemas.microsoft.com/office/word/2018/wordml" xmlns:w16du="http://schemas.microsoft.com/office/word/2023/wordml/word16du" xmlns:w16sdtdh="http://schemas.microsoft.com/office/word/2020/wordml/sdtdatahash" xmlns:w16sdtfl="http://schemas.microsoft.com/office/word/2024/wordml/sdtformatlock" xmlns:w16se="http://schemas.microsoft.com/office/word/2015/wordml/symex" xmlns:wpg="http://schemas.microsoft.com/office/word/2010/wordprocessingGroup" xmlns:wpi="http://schemas.microsoft.com/office/word/2010/wordprocessingInk" xmlns:wne="http://schemas.microsoft.com/office/word/2006/wordml" xmlns:wps="http://schemas.microsoft.com/office/word/2010/wordprocessingShape" mc:Ignorable="w14 w15 w16se w16cid w16 w16cex w16sdtdh w16sdtfl w16du wp14">
   <w:body>
     <w:p>
       <w:pPr>
@@ -336,17 +336,35 @@
           <w:sz w:val="26"/>
           <w:szCs w:val="26"/>
         </w:rPr>
-        <w:t xml:space="preserve"> nascida em </w:t>
-      </w:r>
-      <w:r>
-        <w:rPr>
-          <w:rFonts w:ascii="Arial" w:hAnsi="Arial" w:cs="Arial"/>
-          <w:b/>
-          <w:bCs/>
+        <w:t xml:space="preserve"> nascid</w:t>
+      </w:r>
+      <w:r>
+        <w:rPr>
+          <w:rFonts w:ascii="Arial" w:hAnsi="Arial" w:cs="Arial"/>
           <w:color w:val="000000" w:themeColor="text1"/>
           <w:sz w:val="26"/>
           <w:szCs w:val="26"/>
         </w:rPr>
+        <w:t>o(a)</w:t>
+      </w:r>
+      <w:r>
+        <w:rPr>
+          <w:rFonts w:ascii="Arial" w:hAnsi="Arial" w:cs="Arial"/>
+          <w:color w:val="000000" w:themeColor="text1"/>
+          <w:sz w:val="26"/>
+          <w:szCs w:val="26"/>
+        </w:rPr>
+        <w:t xml:space="preserve"> em </w:t>
+      </w:r>
+      <w:r>
+        <w:rPr>
+          <w:rFonts w:ascii="Arial" w:hAnsi="Arial" w:cs="Arial"/>
+          <w:b/>
+          <w:bCs/>
+          <w:color w:val="000000" w:themeColor="text1"/>
+          <w:sz w:val="26"/>
+          <w:szCs w:val="26"/>
+        </w:rPr>
         <w:t>{{DATA_NASCIMENTO}}</w:t>
       </w:r>
       <w:r>
@@ -365,7 +383,16 @@
           <w:sz w:val="26"/>
           <w:szCs w:val="26"/>
         </w:rPr>
-        <w:t xml:space="preserve">e </w:t>
+        <w:t>local de</w:t>
+      </w:r>
+      <w:r>
+        <w:rPr>
+          <w:rFonts w:ascii="Arial" w:hAnsi="Arial" w:cs="Arial"/>
+          <w:color w:val="000000" w:themeColor="text1"/>
+          <w:sz w:val="26"/>
+          <w:szCs w:val="26"/>
+        </w:rPr>
+        <w:t xml:space="preserve"> </w:t>
       </w:r>
       <w:r>
         <w:rPr>
@@ -1816,9 +1843,8 @@
           <w:sz w:val="26"/>
           <w:szCs w:val="26"/>
         </w:rPr>
-        <w:t>{{</w:t>
-      </w:r>
-      <w:proofErr w:type="gramStart"/>
+        <w:t>{{SALARIO}}</w:t>
+      </w:r>
       <w:r>
         <w:rPr>
           <w:rFonts w:ascii="Arial" w:hAnsi="Arial" w:cs="Arial"/>
@@ -1828,9 +1854,17 @@
           <w:sz w:val="26"/>
           <w:szCs w:val="26"/>
         </w:rPr>
-        <w:t>SALARIO</w:t>
-      </w:r>
-      <w:proofErr w:type="gramEnd"/>
+        <w:t>(</w:t>
+      </w:r>
+      <w:r>
+        <w:rPr>
+          <w:rFonts w:ascii="Arial" w:hAnsi="Arial" w:cs="Arial"/>
+          <w:color w:val="FF0000"/>
+          <w:sz w:val="26"/>
+          <w:szCs w:val="26"/>
+        </w:rPr>
+        <w:t xml:space="preserve"> </w:t>
+      </w:r>
       <w:r>
         <w:rPr>
           <w:rFonts w:ascii="Arial" w:hAnsi="Arial" w:cs="Arial"/>
@@ -1840,16 +1874,7 @@
           <w:sz w:val="26"/>
           <w:szCs w:val="26"/>
         </w:rPr>
-        <w:t>}}</w:t>
-      </w:r>
-      <w:r>
-        <w:rPr>
-          <w:rFonts w:ascii="Arial" w:hAnsi="Arial" w:cs="Arial"/>
-          <w:color w:val="FF0000"/>
-          <w:sz w:val="26"/>
-          <w:szCs w:val="26"/>
-        </w:rPr>
-        <w:t xml:space="preserve"> </w:t>
+        <w:t>{{SALARIO_EXTENSO}}</w:t>
       </w:r>
       <w:r>
         <w:rPr>
@@ -1860,7 +1885,7 @@
           <w:sz w:val="26"/>
           <w:szCs w:val="26"/>
         </w:rPr>
-        <w:t>{{SALARIO_EXTENSO}}</w:t>
+        <w:t>)</w:t>
       </w:r>
       <w:r>
         <w:rPr>
@@ -2111,7 +2136,6 @@
           <w:sz w:val="26"/>
           <w:szCs w:val="26"/>
         </w:rPr>
-        <w:lastRenderedPageBreak/>
         <w:t>JORNADA DE TRABALHO</w:t>
       </w:r>
     </w:p>
@@ -3634,29 +3658,7 @@
           <w:sz w:val="26"/>
           <w:szCs w:val="26"/>
         </w:rPr>
-        <w:t xml:space="preserve"> ou de segurança duvidosa, independentemente do emprego de programas </w:t>
-      </w:r>
-      <w:proofErr w:type="spellStart"/>
-      <w:proofErr w:type="gramStart"/>
-      <w:r>
-        <w:rPr>
-          <w:rFonts w:ascii="Arial" w:hAnsi="Arial" w:cs="Arial"/>
-          <w:bCs/>
-          <w:sz w:val="26"/>
-          <w:szCs w:val="26"/>
-        </w:rPr>
-        <w:t>anti-vírus</w:t>
-      </w:r>
-      <w:proofErr w:type="spellEnd"/>
-      <w:proofErr w:type="gramEnd"/>
-      <w:r>
-        <w:rPr>
-          <w:rFonts w:ascii="Arial" w:hAnsi="Arial" w:cs="Arial"/>
-          <w:bCs/>
-          <w:sz w:val="26"/>
-          <w:szCs w:val="26"/>
-        </w:rPr>
-        <w:t xml:space="preserve">, principalmente para executar quaisquer atividades em prol da empresa, ou para usufruir do seu respectivo banco de dados e equipamentos para finalidades pessoais; </w:t>
+        <w:t xml:space="preserve"> ou de segurança duvidosa, independentemente do emprego de programas anti-vírus, principalmente para executar quaisquer atividades em prol da empresa, ou para usufruir do seu respectivo banco de dados e equipamentos para finalidades pessoais; </w:t>
       </w:r>
     </w:p>
     <w:p>
@@ -3781,27 +3783,7 @@
           <w:sz w:val="26"/>
           <w:szCs w:val="26"/>
         </w:rPr>
-        <w:t xml:space="preserve">i. Manter em absoluto sigilo as informações e dados pessoais de eventuais clientes, fornecedores, parceiros comerciais, e demais contatos de origem profissional que </w:t>
-      </w:r>
-      <w:proofErr w:type="gramStart"/>
-      <w:r>
-        <w:rPr>
-          <w:rFonts w:ascii="Arial" w:hAnsi="Arial" w:cs="Arial"/>
-          <w:bCs/>
-          <w:sz w:val="26"/>
-          <w:szCs w:val="26"/>
-        </w:rPr>
-        <w:t>por ventura</w:t>
-      </w:r>
-      <w:proofErr w:type="gramEnd"/>
-      <w:r>
-        <w:rPr>
-          <w:rFonts w:ascii="Arial" w:hAnsi="Arial" w:cs="Arial"/>
-          <w:bCs/>
-          <w:sz w:val="26"/>
-          <w:szCs w:val="26"/>
-        </w:rPr>
-        <w:t xml:space="preserve"> fizer no desenvolvimento de suas atribuições, ciente de que se tratam de dados e informações sigilosas, de propriedade exclusiva do </w:t>
+        <w:t xml:space="preserve">i. Manter em absoluto sigilo as informações e dados pessoais de eventuais clientes, fornecedores, parceiros comerciais, e demais contatos de origem profissional que por ventura fizer no desenvolvimento de suas atribuições, ciente de que se tratam de dados e informações sigilosas, de propriedade exclusiva do </w:t>
       </w:r>
       <w:r>
         <w:rPr>
@@ -3859,27 +3841,7 @@
           <w:sz w:val="26"/>
           <w:szCs w:val="26"/>
         </w:rPr>
-        <w:t xml:space="preserve">j. Utilizar, nos computadores da empresa, somente programas de sua propriedade ou cuja licença para uso tenha sido obtida de forma legal, comprometendo-se a não </w:t>
-      </w:r>
-      <w:proofErr w:type="gramStart"/>
-      <w:r>
-        <w:rPr>
-          <w:rFonts w:ascii="Arial" w:hAnsi="Arial" w:cs="Arial"/>
-          <w:bCs/>
-          <w:sz w:val="26"/>
-          <w:szCs w:val="26"/>
-        </w:rPr>
-        <w:t>copiá-los</w:t>
-      </w:r>
-      <w:proofErr w:type="gramEnd"/>
-      <w:r>
-        <w:rPr>
-          <w:rFonts w:ascii="Arial" w:hAnsi="Arial" w:cs="Arial"/>
-          <w:bCs/>
-          <w:sz w:val="26"/>
-          <w:szCs w:val="26"/>
-        </w:rPr>
-        <w:t xml:space="preserve"> ou utilizá-los para qualquer finalidade diversa daquela autorizada ou oficializada pela empresa;</w:t>
+        <w:t>j. Utilizar, nos computadores da empresa, somente programas de sua propriedade ou cuja licença para uso tenha sido obtida de forma legal, comprometendo-se a não copiá-los ou utilizá-los para qualquer finalidade diversa daquela autorizada ou oficializada pela empresa;</w:t>
       </w:r>
     </w:p>
     <w:p>
@@ -6238,7 +6200,7 @@
 </file>
 
 <file path=word/endnotes.xml><?xml version="1.0" encoding="utf-8"?>
-<w:endnotes xmlns:wpc="http://schemas.microsoft.com/office/word/2010/wordprocessingCanvas" xmlns:cx="http://schemas.microsoft.com/office/drawing/2014/chartex" xmlns:cx1="http://schemas.microsoft.com/office/drawing/2015/9/8/chartex" xmlns:cx2="http://schemas.microsoft.com/office/drawing/2015/10/21/chartex" xmlns:cx3="http://schemas.microsoft.com/office/drawing/2016/5/9/chartex" xmlns:cx4="http://schemas.microsoft.com/office/drawing/2016/5/10/chartex" xmlns:cx5="http://schemas.microsoft.com/office/drawing/2016/5/11/chartex" xmlns:cx6="http://schemas.microsoft.com/office/drawing/2016/5/12/chartex" xmlns:cx7="http://schemas.microsoft.com/office/drawing/2016/5/13/chartex" xmlns:cx8="http://schemas.microsoft.com/office/drawing/2016/5/14/chartex" xmlns:mc="http://schemas.openxmlformats.org/markup-compatibility/2006" xmlns:aink="http://schemas.microsoft.com/office/drawing/2016/ink" xmlns:am3d="http://schemas.microsoft.com/office/drawing/2017/model3d" xmlns:o="urn:schemas-microsoft-com:office:office" xmlns:oel="http://schemas.microsoft.com/office/2019/extlst" xmlns:r="http://schemas.openxmlformats.org/officeDocument/2006/relationships" xmlns:m="http://schemas.openxmlformats.org/officeDocument/2006/math" xmlns:v="urn:schemas-microsoft-com:vml" xmlns:wp14="http://schemas.microsoft.com/office/word/2010/wordprocessingDrawing" xmlns:wp="http://schemas.openxmlformats.org/drawingml/2006/wordprocessingDrawing" xmlns:w10="urn:schemas-microsoft-com:office:word" xmlns:w="http://schemas.openxmlformats.org/wordprocessingml/2006/main" xmlns:w14="http://schemas.microsoft.com/office/word/2010/wordml" xmlns:w15="http://schemas.microsoft.com/office/word/2012/wordml" xmlns:w16cex="http://schemas.microsoft.com/office/word/2018/wordml/cex" xmlns:w16cid="http://schemas.microsoft.com/office/word/2016/wordml/cid" xmlns:w16="http://schemas.microsoft.com/office/word/2018/wordml" xmlns:w16du="http://schemas.microsoft.com/office/word/2023/wordml/word16du" xmlns:w16sdtdh="http://schemas.microsoft.com/office/word/2020/wordml/sdtdatahash" xmlns:w16se="http://schemas.microsoft.com/office/word/2015/wordml/symex" xmlns:wpg="http://schemas.microsoft.com/office/word/2010/wordprocessingGroup" xmlns:wpi="http://schemas.microsoft.com/office/word/2010/wordprocessingInk" xmlns:wne="http://schemas.microsoft.com/office/word/2006/wordml" xmlns:wps="http://schemas.microsoft.com/office/word/2010/wordprocessingShape" mc:Ignorable="w14 w15 w16se w16cid w16 w16cex w16sdtdh wp14">
+<w:endnotes xmlns:wpc="http://schemas.microsoft.com/office/word/2010/wordprocessingCanvas" xmlns:cx="http://schemas.microsoft.com/office/drawing/2014/chartex" xmlns:cx1="http://schemas.microsoft.com/office/drawing/2015/9/8/chartex" xmlns:cx2="http://schemas.microsoft.com/office/drawing/2015/10/21/chartex" xmlns:cx3="http://schemas.microsoft.com/office/drawing/2016/5/9/chartex" xmlns:cx4="http://schemas.microsoft.com/office/drawing/2016/5/10/chartex" xmlns:cx5="http://schemas.microsoft.com/office/drawing/2016/5/11/chartex" xmlns:cx6="http://schemas.microsoft.com/office/drawing/2016/5/12/chartex" xmlns:cx7="http://schemas.microsoft.com/office/drawing/2016/5/13/chartex" xmlns:cx8="http://schemas.microsoft.com/office/drawing/2016/5/14/chartex" xmlns:mc="http://schemas.openxmlformats.org/markup-compatibility/2006" xmlns:aink="http://schemas.microsoft.com/office/drawing/2016/ink" xmlns:am3d="http://schemas.microsoft.com/office/drawing/2017/model3d" xmlns:o="urn:schemas-microsoft-com:office:office" xmlns:oel="http://schemas.microsoft.com/office/2019/extlst" xmlns:r="http://schemas.openxmlformats.org/officeDocument/2006/relationships" xmlns:m="http://schemas.openxmlformats.org/officeDocument/2006/math" xmlns:v="urn:schemas-microsoft-com:vml" xmlns:wp14="http://schemas.microsoft.com/office/word/2010/wordprocessingDrawing" xmlns:wp="http://schemas.openxmlformats.org/drawingml/2006/wordprocessingDrawing" xmlns:w10="urn:schemas-microsoft-com:office:word" xmlns:w="http://schemas.openxmlformats.org/wordprocessingml/2006/main" xmlns:w14="http://schemas.microsoft.com/office/word/2010/wordml" xmlns:w15="http://schemas.microsoft.com/office/word/2012/wordml" xmlns:w16cex="http://schemas.microsoft.com/office/word/2018/wordml/cex" xmlns:w16cid="http://schemas.microsoft.com/office/word/2016/wordml/cid" xmlns:w16="http://schemas.microsoft.com/office/word/2018/wordml" xmlns:w16du="http://schemas.microsoft.com/office/word/2023/wordml/word16du" xmlns:w16sdtdh="http://schemas.microsoft.com/office/word/2020/wordml/sdtdatahash" xmlns:w16sdtfl="http://schemas.microsoft.com/office/word/2024/wordml/sdtformatlock" xmlns:w16se="http://schemas.microsoft.com/office/word/2015/wordml/symex" xmlns:wpg="http://schemas.microsoft.com/office/word/2010/wordprocessingGroup" xmlns:wpi="http://schemas.microsoft.com/office/word/2010/wordprocessingInk" xmlns:wne="http://schemas.microsoft.com/office/word/2006/wordml" xmlns:wps="http://schemas.microsoft.com/office/word/2010/wordprocessingShape" mc:Ignorable="w14 w15 w16se w16cid w16 w16cex w16sdtdh w16sdtfl w16du wp14">
   <w:endnote w:type="separator" w:id="-1">
     <w:p>
       <w:r>
@@ -6257,7 +6219,7 @@
 </file>
 
 <file path=word/footnotes.xml><?xml version="1.0" encoding="utf-8"?>
-<w:footnotes xmlns:wpc="http://schemas.microsoft.com/office/word/2010/wordprocessingCanvas" xmlns:cx="http://schemas.microsoft.com/office/drawing/2014/chartex" xmlns:cx1="http://schemas.microsoft.com/office/drawing/2015/9/8/chartex" xmlns:cx2="http://schemas.microsoft.com/office/drawing/2015/10/21/chartex" xmlns:cx3="http://schemas.microsoft.com/office/drawing/2016/5/9/chartex" xmlns:cx4="http://schemas.microsoft.com/office/drawing/2016/5/10/chartex" xmlns:cx5="http://schemas.microsoft.com/office/drawing/2016/5/11/chartex" xmlns:cx6="http://schemas.microsoft.com/office/drawing/2016/5/12/chartex" xmlns:cx7="http://schemas.microsoft.com/office/drawing/2016/5/13/chartex" xmlns:cx8="http://schemas.microsoft.com/office/drawing/2016/5/14/chartex" xmlns:mc="http://schemas.openxmlformats.org/markup-compatibility/2006" xmlns:aink="http://schemas.microsoft.com/office/drawing/2016/ink" xmlns:am3d="http://schemas.microsoft.com/office/drawing/2017/model3d" xmlns:o="urn:schemas-microsoft-com:office:office" xmlns:oel="http://schemas.microsoft.com/office/2019/extlst" xmlns:r="http://schemas.openxmlformats.org/officeDocument/2006/relationships" xmlns:m="http://schemas.openxmlformats.org/officeDocument/2006/math" xmlns:v="urn:schemas-microsoft-com:vml" xmlns:wp14="http://schemas.microsoft.com/office/word/2010/wordprocessingDrawing" xmlns:wp="http://schemas.openxmlformats.org/drawingml/2006/wordprocessingDrawing" xmlns:w10="urn:schemas-microsoft-com:office:word" xmlns:w="http://schemas.openxmlformats.org/wordprocessingml/2006/main" xmlns:w14="http://schemas.microsoft.com/office/word/2010/wordml" xmlns:w15="http://schemas.microsoft.com/office/word/2012/wordml" xmlns:w16cex="http://schemas.microsoft.com/office/word/2018/wordml/cex" xmlns:w16cid="http://schemas.microsoft.com/office/word/2016/wordml/cid" xmlns:w16="http://schemas.microsoft.com/office/word/2018/wordml" xmlns:w16du="http://schemas.microsoft.com/office/word/2023/wordml/word16du" xmlns:w16sdtdh="http://schemas.microsoft.com/office/word/2020/wordml/sdtdatahash" xmlns:w16se="http://schemas.microsoft.com/office/word/2015/wordml/symex" xmlns:wpg="http://schemas.microsoft.com/office/word/2010/wordprocessingGroup" xmlns:wpi="http://schemas.microsoft.com/office/word/2010/wordprocessingInk" xmlns:wne="http://schemas.microsoft.com/office/word/2006/wordml" xmlns:wps="http://schemas.microsoft.com/office/word/2010/wordprocessingShape" mc:Ignorable="w14 w15 w16se w16cid w16 w16cex w16sdtdh wp14">
+<w:footnotes xmlns:wpc="http://schemas.microsoft.com/office/word/2010/wordprocessingCanvas" xmlns:cx="http://schemas.microsoft.com/office/drawing/2014/chartex" xmlns:cx1="http://schemas.microsoft.com/office/drawing/2015/9/8/chartex" xmlns:cx2="http://schemas.microsoft.com/office/drawing/2015/10/21/chartex" xmlns:cx3="http://schemas.microsoft.com/office/drawing/2016/5/9/chartex" xmlns:cx4="http://schemas.microsoft.com/office/drawing/2016/5/10/chartex" xmlns:cx5="http://schemas.microsoft.com/office/drawing/2016/5/11/chartex" xmlns:cx6="http://schemas.microsoft.com/office/drawing/2016/5/12/chartex" xmlns:cx7="http://schemas.microsoft.com/office/drawing/2016/5/13/chartex" xmlns:cx8="http://schemas.microsoft.com/office/drawing/2016/5/14/chartex" xmlns:mc="http://schemas.openxmlformats.org/markup-compatibility/2006" xmlns:aink="http://schemas.microsoft.com/office/drawing/2016/ink" xmlns:am3d="http://schemas.microsoft.com/office/drawing/2017/model3d" xmlns:o="urn:schemas-microsoft-com:office:office" xmlns:oel="http://schemas.microsoft.com/office/2019/extlst" xmlns:r="http://schemas.openxmlformats.org/officeDocument/2006/relationships" xmlns:m="http://schemas.openxmlformats.org/officeDocument/2006/math" xmlns:v="urn:schemas-microsoft-com:vml" xmlns:wp14="http://schemas.microsoft.com/office/word/2010/wordprocessingDrawing" xmlns:wp="http://schemas.openxmlformats.org/drawingml/2006/wordprocessingDrawing" xmlns:w10="urn:schemas-microsoft-com:office:word" xmlns:w="http://schemas.openxmlformats.org/wordprocessingml/2006/main" xmlns:w14="http://schemas.microsoft.com/office/word/2010/wordml" xmlns:w15="http://schemas.microsoft.com/office/word/2012/wordml" xmlns:w16cex="http://schemas.microsoft.com/office/word/2018/wordml/cex" xmlns:w16cid="http://schemas.microsoft.com/office/word/2016/wordml/cid" xmlns:w16="http://schemas.microsoft.com/office/word/2018/wordml" xmlns:w16du="http://schemas.microsoft.com/office/word/2023/wordml/word16du" xmlns:w16sdtdh="http://schemas.microsoft.com/office/word/2020/wordml/sdtdatahash" xmlns:w16sdtfl="http://schemas.microsoft.com/office/word/2024/wordml/sdtformatlock" xmlns:w16se="http://schemas.microsoft.com/office/word/2015/wordml/symex" xmlns:wpg="http://schemas.microsoft.com/office/word/2010/wordprocessingGroup" xmlns:wpi="http://schemas.microsoft.com/office/word/2010/wordprocessingInk" xmlns:wne="http://schemas.microsoft.com/office/word/2006/wordml" xmlns:wps="http://schemas.microsoft.com/office/word/2010/wordprocessingShape" mc:Ignorable="w14 w15 w16se w16cid w16 w16cex w16sdtdh w16sdtfl w16du wp14">
   <w:footnote w:type="separator" w:id="-1">
     <w:p>
       <w:r>
@@ -6276,7 +6238,7 @@
 </file>
 
 <file path=word/header1.xml><?xml version="1.0" encoding="utf-8"?>
-<w:hdr xmlns:wpc="http://schemas.microsoft.com/office/word/2010/wordprocessingCanvas" xmlns:cx="http://schemas.microsoft.com/office/drawing/2014/chartex" xmlns:cx1="http://schemas.microsoft.com/office/drawing/2015/9/8/chartex" xmlns:cx2="http://schemas.microsoft.com/office/drawing/2015/10/21/chartex" xmlns:cx3="http://schemas.microsoft.com/office/drawing/2016/5/9/chartex" xmlns:cx4="http://schemas.microsoft.com/office/drawing/2016/5/10/chartex" xmlns:cx5="http://schemas.microsoft.com/office/drawing/2016/5/11/chartex" xmlns:cx6="http://schemas.microsoft.com/office/drawing/2016/5/12/chartex" xmlns:cx7="http://schemas.microsoft.com/office/drawing/2016/5/13/chartex" xmlns:cx8="http://schemas.microsoft.com/office/drawing/2016/5/14/chartex" xmlns:mc="http://schemas.openxmlformats.org/markup-compatibility/2006" xmlns:aink="http://schemas.microsoft.com/office/drawing/2016/ink" xmlns:am3d="http://schemas.microsoft.com/office/drawing/2017/model3d" xmlns:o="urn:schemas-microsoft-com:office:office" xmlns:oel="http://schemas.microsoft.com/office/2019/extlst" xmlns:r="http://schemas.openxmlformats.org/officeDocument/2006/relationships" xmlns:m="http://schemas.openxmlformats.org/officeDocument/2006/math" xmlns:v="urn:schemas-microsoft-com:vml" xmlns:wp14="http://schemas.microsoft.com/office/word/2010/wordprocessingDrawing" xmlns:wp="http://schemas.openxmlformats.org/drawingml/2006/wordprocessingDrawing" xmlns:w10="urn:schemas-microsoft-com:office:word" xmlns:w="http://schemas.openxmlformats.org/wordprocessingml/2006/main" xmlns:w14="http://schemas.microsoft.com/office/word/2010/wordml" xmlns:w15="http://schemas.microsoft.com/office/word/2012/wordml" xmlns:w16cex="http://schemas.microsoft.com/office/word/2018/wordml/cex" xmlns:w16cid="http://schemas.microsoft.com/office/word/2016/wordml/cid" xmlns:w16="http://schemas.microsoft.com/office/word/2018/wordml" xmlns:w16du="http://schemas.microsoft.com/office/word/2023/wordml/word16du" xmlns:w16sdtdh="http://schemas.microsoft.com/office/word/2020/wordml/sdtdatahash" xmlns:w16se="http://schemas.microsoft.com/office/word/2015/wordml/symex" xmlns:wpg="http://schemas.microsoft.com/office/word/2010/wordprocessingGroup" xmlns:wpi="http://schemas.microsoft.com/office/word/2010/wordprocessingInk" xmlns:wne="http://schemas.microsoft.com/office/word/2006/wordml" xmlns:wps="http://schemas.microsoft.com/office/word/2010/wordprocessingShape" mc:Ignorable="w14 w15 w16se w16cid w16 w16cex w16sdtdh wp14">
+<w:hdr xmlns:wpc="http://schemas.microsoft.com/office/word/2010/wordprocessingCanvas" xmlns:cx="http://schemas.microsoft.com/office/drawing/2014/chartex" xmlns:cx1="http://schemas.microsoft.com/office/drawing/2015/9/8/chartex" xmlns:cx2="http://schemas.microsoft.com/office/drawing/2015/10/21/chartex" xmlns:cx3="http://schemas.microsoft.com/office/drawing/2016/5/9/chartex" xmlns:cx4="http://schemas.microsoft.com/office/drawing/2016/5/10/chartex" xmlns:cx5="http://schemas.microsoft.com/office/drawing/2016/5/11/chartex" xmlns:cx6="http://schemas.microsoft.com/office/drawing/2016/5/12/chartex" xmlns:cx7="http://schemas.microsoft.com/office/drawing/2016/5/13/chartex" xmlns:cx8="http://schemas.microsoft.com/office/drawing/2016/5/14/chartex" xmlns:mc="http://schemas.openxmlformats.org/markup-compatibility/2006" xmlns:aink="http://schemas.microsoft.com/office/drawing/2016/ink" xmlns:am3d="http://schemas.microsoft.com/office/drawing/2017/model3d" xmlns:o="urn:schemas-microsoft-com:office:office" xmlns:oel="http://schemas.microsoft.com/office/2019/extlst" xmlns:r="http://schemas.openxmlformats.org/officeDocument/2006/relationships" xmlns:m="http://schemas.openxmlformats.org/officeDocument/2006/math" xmlns:v="urn:schemas-microsoft-com:vml" xmlns:wp14="http://schemas.microsoft.com/office/word/2010/wordprocessingDrawing" xmlns:wp="http://schemas.openxmlformats.org/drawingml/2006/wordprocessingDrawing" xmlns:w10="urn:schemas-microsoft-com:office:word" xmlns:w="http://schemas.openxmlformats.org/wordprocessingml/2006/main" xmlns:w14="http://schemas.microsoft.com/office/word/2010/wordml" xmlns:w15="http://schemas.microsoft.com/office/word/2012/wordml" xmlns:w16cex="http://schemas.microsoft.com/office/word/2018/wordml/cex" xmlns:w16cid="http://schemas.microsoft.com/office/word/2016/wordml/cid" xmlns:w16="http://schemas.microsoft.com/office/word/2018/wordml" xmlns:w16du="http://schemas.microsoft.com/office/word/2023/wordml/word16du" xmlns:w16sdtdh="http://schemas.microsoft.com/office/word/2020/wordml/sdtdatahash" xmlns:w16sdtfl="http://schemas.microsoft.com/office/word/2024/wordml/sdtformatlock" xmlns:w16se="http://schemas.microsoft.com/office/word/2015/wordml/symex" xmlns:wpg="http://schemas.microsoft.com/office/word/2010/wordprocessingGroup" xmlns:wpi="http://schemas.microsoft.com/office/word/2010/wordprocessingInk" xmlns:wne="http://schemas.microsoft.com/office/word/2006/wordml" xmlns:wps="http://schemas.microsoft.com/office/word/2010/wordprocessingShape" mc:Ignorable="w14 w15 w16se w16cid w16 w16cex w16sdtdh w16sdtfl w16du wp14">
   <w:p>
     <w:pPr>
       <w:tabs>
@@ -6316,7 +6278,7 @@
 </file>
 
 <file path=word/styles.xml><?xml version="1.0" encoding="utf-8"?>
-<w:styles xmlns:mc="http://schemas.openxmlformats.org/markup-compatibility/2006" xmlns:r="http://schemas.openxmlformats.org/officeDocument/2006/relationships" xmlns:w="http://schemas.openxmlformats.org/wordprocessingml/2006/main" xmlns:w14="http://schemas.microsoft.com/office/word/2010/wordml" xmlns:w15="http://schemas.microsoft.com/office/word/2012/wordml" xmlns:w16cex="http://schemas.microsoft.com/office/word/2018/wordml/cex" xmlns:w16cid="http://schemas.microsoft.com/office/word/2016/wordml/cid" xmlns:w16="http://schemas.microsoft.com/office/word/2018/wordml" xmlns:w16sdtdh="http://schemas.microsoft.com/office/word/2020/wordml/sdtdatahash" xmlns:w16se="http://schemas.microsoft.com/office/word/2015/wordml/symex" mc:Ignorable="w14 w15 w16se w16cid w16 w16cex w16sdtdh">
+<w:styles xmlns:mc="http://schemas.openxmlformats.org/markup-compatibility/2006" xmlns:r="http://schemas.openxmlformats.org/officeDocument/2006/relationships" xmlns:w="http://schemas.openxmlformats.org/wordprocessingml/2006/main" xmlns:w14="http://schemas.microsoft.com/office/word/2010/wordml" xmlns:w15="http://schemas.microsoft.com/office/word/2012/wordml" xmlns:w16cex="http://schemas.microsoft.com/office/word/2018/wordml/cex" xmlns:w16cid="http://schemas.microsoft.com/office/word/2016/wordml/cid" xmlns:w16="http://schemas.microsoft.com/office/word/2018/wordml" xmlns:w16du="http://schemas.microsoft.com/office/word/2023/wordml/word16du" xmlns:w16sdtdh="http://schemas.microsoft.com/office/word/2020/wordml/sdtdatahash" xmlns:w16sdtfl="http://schemas.microsoft.com/office/word/2024/wordml/sdtformatlock" xmlns:w16se="http://schemas.microsoft.com/office/word/2015/wordml/symex" mc:Ignorable="w14 w15 w16se w16cid w16 w16cex w16sdtdh w16sdtfl w16du">
   <w:docDefaults>
     <w:rPrDefault>
       <w:rPr>

</xml_diff>